<commit_message>
Add padding/resolution/eyebox items to 10.9's open-items list
These were already in the closing note and Gap table but missing from
10.9 itself, leaving the open-items list stale relative to the rest
of the document.

Co-Authored-By: Claude Sonnet 5 <noreply@anthropic.com>
</commit_message>
<xml_diff>
--- a/Docs/AR_Glasses_Technical_Reference_v24.docx
+++ b/Docs/AR_Glasses_Technical_Reference_v24.docx
@@ -7371,6 +7371,22 @@
       </w:pPr>
       <w:r>
         <w:t xml:space="preserve">Warm-starting and scene-cut robustness have now been validated against genuinely independent content (10.5), closing that gap — but real motion-capture or recorded UI-interaction footage still hasn't been tested, only procedurally-generated stand-ins for it.</w:t>
+      </w:r>
+    </w:p>
+    <w:p>
+      <w:pPr>
+        <w:pStyle w:val="ListParagraph"/>
+      </w:pPr>
+      <w:r>
+        <w:t>A lower padding factor showed anywhere from 10% to 53% compute savings depending on seed count in early testing (Appendix A.14.8) — not yet reliably pinned down; needs the same 8-seed/400-iteration treatment the compute baseline received before it can be cited as a number.</w:t>
+      </w:r>
+    </w:p>
+    <w:p>
+      <w:pPr>
+        <w:pStyle w:val="ListParagraph"/>
+      </w:pPr>
+      <w:r>
+        <w:t>Two candidates from comparing this project's targets against a real published system (10.11) are tested and awaiting a specification decision, not further simulation: relaxing the resolution target (10.10, ~74% power reduction, no measured quality cost on this project's content) and adopting a MEMS-steered synthetic-aperture eyebox strategy in place of discrete-position cycling (untested in this project's own pipeline, a materially bigger undertaking than the resolution test).</w:t>
       </w:r>
     </w:p>
     <w:p>

</xml_diff>